<commit_message>
Recursos: creacon de datasheets
</commit_message>
<xml_diff>
--- a/00_Presentacion/.bruto/LAVANDERÍA KWL- Sistema integral de gestión, autumatización y control de una lavanderia .docx
+++ b/00_Presentacion/.bruto/LAVANDERÍA KWL- Sistema integral de gestión, autumatización y control de una lavanderia .docx
@@ -47,7 +47,34 @@
           <w:szCs w:val="40"/>
           <w:u w:val="single"/>
         </w:rPr>
-        <w:t>CURSO 20__- 20__</w:t>
+        <w:t>CURSO 20</w:t>
+      </w:r>
+      <w:r>
+        <w:rPr>
+          <w:rFonts w:ascii="Verdana" w:hAnsi="Verdana"/>
+          <w:sz w:val="40"/>
+          <w:szCs w:val="40"/>
+          <w:u w:val="single"/>
+        </w:rPr>
+        <w:t>25</w:t>
+      </w:r>
+      <w:r>
+        <w:rPr>
+          <w:rFonts w:ascii="Verdana" w:hAnsi="Verdana"/>
+          <w:sz w:val="40"/>
+          <w:szCs w:val="40"/>
+          <w:u w:val="single"/>
+        </w:rPr>
+        <w:t>- 20</w:t>
+      </w:r>
+      <w:r>
+        <w:rPr>
+          <w:rFonts w:ascii="Verdana" w:hAnsi="Verdana"/>
+          <w:sz w:val="40"/>
+          <w:szCs w:val="40"/>
+          <w:u w:val="single"/>
+        </w:rPr>
+        <w:t>26</w:t>
       </w:r>
     </w:p>
     <w:p>
@@ -89,6 +116,122 @@
         </w:rPr>
         <w:t>:</w:t>
       </w:r>
+      <w:r>
+        <w:t xml:space="preserve"> </w:t>
+      </w:r>
+      <w:r>
+        <w:rPr>
+          <w:rFonts w:ascii="Verdana" w:hAnsi="Verdana"/>
+          <w:sz w:val="48"/>
+          <w:szCs w:val="48"/>
+        </w:rPr>
+        <w:t>LAVANDERÍA</w:t>
+      </w:r>
+      <w:r>
+        <w:rPr>
+          <w:rFonts w:ascii="Verdana" w:hAnsi="Verdana"/>
+          <w:sz w:val="48"/>
+          <w:szCs w:val="48"/>
+        </w:rPr>
+        <w:t xml:space="preserve"> </w:t>
+      </w:r>
+      <w:r>
+        <w:rPr>
+          <w:rFonts w:ascii="Verdana" w:hAnsi="Verdana"/>
+          <w:sz w:val="48"/>
+          <w:szCs w:val="48"/>
+        </w:rPr>
+        <w:t>KWL:</w:t>
+      </w:r>
+      <w:r>
+        <w:rPr>
+          <w:rFonts w:ascii="Verdana" w:hAnsi="Verdana"/>
+          <w:sz w:val="48"/>
+          <w:szCs w:val="48"/>
+        </w:rPr>
+        <w:t xml:space="preserve"> </w:t>
+      </w:r>
+      <w:r>
+        <w:rPr>
+          <w:rFonts w:ascii="Verdana" w:hAnsi="Verdana"/>
+          <w:sz w:val="48"/>
+          <w:szCs w:val="48"/>
+        </w:rPr>
+        <w:t>SISTEMA</w:t>
+      </w:r>
+      <w:r>
+        <w:rPr>
+          <w:rFonts w:ascii="Verdana" w:hAnsi="Verdana"/>
+          <w:sz w:val="48"/>
+          <w:szCs w:val="48"/>
+        </w:rPr>
+        <w:t xml:space="preserve"> </w:t>
+      </w:r>
+      <w:r>
+        <w:rPr>
+          <w:rFonts w:ascii="Verdana" w:hAnsi="Verdana"/>
+          <w:sz w:val="48"/>
+          <w:szCs w:val="48"/>
+        </w:rPr>
+        <w:t>INTEGRAL DE GESTIÓN,</w:t>
+      </w:r>
+      <w:r>
+        <w:rPr>
+          <w:rFonts w:ascii="Verdana" w:hAnsi="Verdana"/>
+          <w:sz w:val="48"/>
+          <w:szCs w:val="48"/>
+        </w:rPr>
+        <w:t xml:space="preserve"> </w:t>
+      </w:r>
+      <w:r>
+        <w:rPr>
+          <w:rFonts w:ascii="Verdana" w:hAnsi="Verdana"/>
+          <w:sz w:val="48"/>
+          <w:szCs w:val="48"/>
+        </w:rPr>
+        <w:t>AUTOMATIZACIÓN Y</w:t>
+      </w:r>
+      <w:r>
+        <w:rPr>
+          <w:rFonts w:ascii="Verdana" w:hAnsi="Verdana"/>
+          <w:sz w:val="48"/>
+          <w:szCs w:val="48"/>
+        </w:rPr>
+        <w:t xml:space="preserve"> </w:t>
+      </w:r>
+      <w:r>
+        <w:rPr>
+          <w:rFonts w:ascii="Verdana" w:hAnsi="Verdana"/>
+          <w:sz w:val="48"/>
+          <w:szCs w:val="48"/>
+        </w:rPr>
+        <w:t>CONTROL DE UNA</w:t>
+      </w:r>
+      <w:r>
+        <w:rPr>
+          <w:rFonts w:ascii="Verdana" w:hAnsi="Verdana"/>
+          <w:sz w:val="48"/>
+          <w:szCs w:val="48"/>
+        </w:rPr>
+        <w:t xml:space="preserve"> </w:t>
+      </w:r>
+      <w:r>
+        <w:rPr>
+          <w:rFonts w:ascii="Verdana" w:hAnsi="Verdana"/>
+          <w:sz w:val="48"/>
+          <w:szCs w:val="48"/>
+        </w:rPr>
+        <w:t>LAVANDERÍA</w:t>
+      </w:r>
+    </w:p>
+    <w:p>
+      <w:pPr>
+        <w:rPr>
+          <w:rFonts w:ascii="Verdana" w:hAnsi="Verdana"/>
+          <w:sz w:val="48"/>
+          <w:szCs w:val="48"/>
+        </w:rPr>
+      </w:pPr>
     </w:p>
     <w:p>
       <w:pPr>
@@ -104,6 +247,22 @@
           <w:szCs w:val="48"/>
         </w:rPr>
       </w:pPr>
+      <w:r>
+        <w:rPr>
+          <w:rFonts w:ascii="Verdana" w:hAnsi="Verdana"/>
+          <w:sz w:val="48"/>
+          <w:szCs w:val="48"/>
+        </w:rPr>
+        <w:t>ALUMNO:</w:t>
+      </w:r>
+      <w:r>
+        <w:rPr>
+          <w:rFonts w:ascii="Verdana" w:hAnsi="Verdana"/>
+          <w:sz w:val="48"/>
+          <w:szCs w:val="48"/>
+        </w:rPr>
+        <w:t xml:space="preserve"> Diego Rodríguez López</w:t>
+      </w:r>
     </w:p>
     <w:p>
       <w:pPr>
@@ -134,70 +293,16 @@
           <w:sz w:val="48"/>
           <w:szCs w:val="48"/>
         </w:rPr>
-        <w:t>ALUMNO:</w:t>
-      </w:r>
-    </w:p>
-    <w:p>
-      <w:pPr>
-        <w:pBdr>
-          <w:top w:val="single" w:sz="4" w:space="1" w:color="auto"/>
-          <w:left w:val="single" w:sz="4" w:space="4" w:color="auto"/>
-          <w:bottom w:val="single" w:sz="4" w:space="1" w:color="auto"/>
-          <w:right w:val="single" w:sz="4" w:space="4" w:color="auto"/>
-        </w:pBdr>
+        <w:t xml:space="preserve">CICLO FORMATIVO: </w:t>
+      </w:r>
+      <w:r>
         <w:rPr>
           <w:rFonts w:ascii="Verdana" w:hAnsi="Verdana"/>
           <w:sz w:val="48"/>
           <w:szCs w:val="48"/>
         </w:rPr>
-      </w:pPr>
-    </w:p>
-    <w:p>
-      <w:pPr>
-        <w:rPr>
-          <w:rFonts w:ascii="Verdana" w:hAnsi="Verdana"/>
-          <w:sz w:val="48"/>
-          <w:szCs w:val="48"/>
-        </w:rPr>
-      </w:pPr>
-    </w:p>
-    <w:p>
-      <w:pPr>
-        <w:pBdr>
-          <w:top w:val="single" w:sz="4" w:space="1" w:color="auto"/>
-          <w:left w:val="single" w:sz="4" w:space="4" w:color="auto"/>
-          <w:bottom w:val="single" w:sz="4" w:space="1" w:color="auto"/>
-          <w:right w:val="single" w:sz="4" w:space="4" w:color="auto"/>
-        </w:pBdr>
-        <w:rPr>
-          <w:rFonts w:ascii="Verdana" w:hAnsi="Verdana"/>
-          <w:sz w:val="48"/>
-          <w:szCs w:val="48"/>
-        </w:rPr>
-      </w:pPr>
-      <w:r>
-        <w:rPr>
-          <w:rFonts w:ascii="Verdana" w:hAnsi="Verdana"/>
-          <w:sz w:val="48"/>
-          <w:szCs w:val="48"/>
-        </w:rPr>
-        <w:t xml:space="preserve">CICLO FORMATIVO: </w:t>
-      </w:r>
-    </w:p>
-    <w:p>
-      <w:pPr>
-        <w:pBdr>
-          <w:top w:val="single" w:sz="4" w:space="1" w:color="auto"/>
-          <w:left w:val="single" w:sz="4" w:space="4" w:color="auto"/>
-          <w:bottom w:val="single" w:sz="4" w:space="1" w:color="auto"/>
-          <w:right w:val="single" w:sz="4" w:space="4" w:color="auto"/>
-        </w:pBdr>
-        <w:rPr>
-          <w:rFonts w:ascii="Verdana" w:hAnsi="Verdana"/>
-          <w:sz w:val="48"/>
-          <w:szCs w:val="48"/>
-        </w:rPr>
-      </w:pPr>
+        <w:t>Desarrollo de aplicaciones web</w:t>
+      </w:r>
     </w:p>
     <w:p>
       <w:pPr>
@@ -230,21 +335,14 @@
         </w:rPr>
         <w:t>TUTOR:</w:t>
       </w:r>
-    </w:p>
-    <w:p>
-      <w:pPr>
-        <w:pBdr>
-          <w:top w:val="single" w:sz="2" w:space="1" w:color="auto"/>
-          <w:left w:val="single" w:sz="2" w:space="4" w:color="auto"/>
-          <w:bottom w:val="single" w:sz="2" w:space="1" w:color="auto"/>
-          <w:right w:val="single" w:sz="2" w:space="4" w:color="auto"/>
-        </w:pBdr>
+      <w:r>
         <w:rPr>
           <w:rFonts w:ascii="Verdana" w:hAnsi="Verdana"/>
           <w:sz w:val="48"/>
           <w:szCs w:val="48"/>
         </w:rPr>
-      </w:pPr>
+        <w:t xml:space="preserve"> Sonia Sagrario Mastache Maestre</w:t>
+      </w:r>
     </w:p>
     <w:p>
       <w:pPr>
@@ -2844,11 +2942,19 @@
           <w:lang w:val="en-US"/>
         </w:rPr>
       </w:pPr>
+      <w:proofErr w:type="spellStart"/>
       <w:r>
         <w:rPr>
           <w:lang w:val="en-US"/>
         </w:rPr>
-        <w:t>Ejemplo:</w:t>
+        <w:t>Ejemplo</w:t>
+      </w:r>
+      <w:proofErr w:type="spellEnd"/>
+      <w:r>
+        <w:rPr>
+          <w:lang w:val="en-US"/>
+        </w:rPr>
+        <w:t>:</w:t>
       </w:r>
     </w:p>
     <w:p>
@@ -4706,14 +4812,10 @@
     <w:pPr>
       <w:pStyle w:val="Encabezado"/>
       <w:tabs>
+        <w:tab w:val="clear" w:pos="4252"/>
         <w:tab w:val="clear" w:pos="8504"/>
-        <w:tab w:val="right" w:pos="8931"/>
+        <w:tab w:val="left" w:pos="6521"/>
       </w:tabs>
-      <w:rPr>
-        <w:b/>
-        <w:sz w:val="18"/>
-        <w:szCs w:val="18"/>
-      </w:rPr>
     </w:pPr>
     <w:r>
       <w:rPr>
@@ -4721,18 +4823,31 @@
         <w:sz w:val="18"/>
         <w:szCs w:val="18"/>
       </w:rPr>
-      <w:t>Título del Proyecto</w:t>
+      <w:t xml:space="preserve">LAVANDERIA KWL: </w:t>
+    </w:r>
+    <w:r>
+      <w:rPr>
+        <w:b/>
+        <w:sz w:val="18"/>
+        <w:szCs w:val="18"/>
+      </w:rPr>
+      <w:t>SISTEMA INTEGRAL DE GESTIÓN, AUTOMATIZACIÓN Y CONTROL DE UNA LAVANDERÍA</w:t>
+    </w:r>
+    <w:r>
+      <w:rPr>
+        <w:b/>
+        <w:sz w:val="18"/>
+        <w:szCs w:val="18"/>
+      </w:rPr>
+      <w:t xml:space="preserve"> </w:t>
+    </w:r>
+    <w:r>
+      <w:tab/>
     </w:r>
   </w:p>
   <w:p>
     <w:pPr>
       <w:pStyle w:val="Encabezado"/>
-      <w:tabs>
-        <w:tab w:val="clear" w:pos="4252"/>
-        <w:tab w:val="clear" w:pos="8504"/>
-        <w:tab w:val="left" w:pos="6521"/>
-      </w:tabs>
-      <w:ind w:left="1416"/>
     </w:pPr>
     <w:r>
       <w:rPr>
@@ -4742,13 +4857,13 @@
       <mc:AlternateContent>
         <mc:Choice Requires="wps">
           <w:drawing>
-            <wp:anchor distT="4294967295" distB="4294967295" distL="114300" distR="114300" simplePos="0" relativeHeight="251656704" behindDoc="0" locked="0" layoutInCell="1" allowOverlap="1" wp14:anchorId="78117B44" wp14:editId="51B2EA52">
+            <wp:anchor distT="4294967295" distB="4294967295" distL="114300" distR="114300" simplePos="0" relativeHeight="251656704" behindDoc="0" locked="0" layoutInCell="1" allowOverlap="1" wp14:anchorId="78117B44" wp14:editId="716B42EA">
               <wp:simplePos x="0" y="0"/>
               <wp:positionH relativeFrom="column">
                 <wp:posOffset>-13335</wp:posOffset>
               </wp:positionH>
               <wp:positionV relativeFrom="paragraph">
-                <wp:posOffset>58420</wp:posOffset>
+                <wp:posOffset>22225</wp:posOffset>
               </wp:positionV>
               <wp:extent cx="5575300" cy="0"/>
               <wp:effectExtent l="0" t="0" r="25400" b="19050"/>
@@ -4803,23 +4918,15 @@
         </mc:Choice>
         <mc:Fallback>
           <w:pict>
-            <v:shapetype w14:anchorId="7398FC78" id="_x0000_t32" coordsize="21600,21600" o:spt="32" o:oned="t" path="m,l21600,21600e" filled="f">
+            <v:shapetype w14:anchorId="4E66A1C0" id="_x0000_t32" coordsize="21600,21600" o:spt="32" o:oned="t" path="m,l21600,21600e" filled="f">
               <v:path arrowok="t" fillok="f" o:connecttype="none"/>
               <o:lock v:ext="edit" shapetype="t"/>
             </v:shapetype>
-            <v:shape id="AutoShape 17" o:spid="_x0000_s1026" type="#_x0000_t32" style="position:absolute;margin-left:-1.05pt;margin-top:4.6pt;width:439pt;height:0;z-index:251656704;visibility:visible;mso-wrap-style:square;mso-width-percent:0;mso-height-percent:0;mso-wrap-distance-left:9pt;mso-wrap-distance-top:-3e-5mm;mso-wrap-distance-right:9pt;mso-wrap-distance-bottom:-3e-5mm;mso-position-horizontal:absolute;mso-position-horizontal-relative:text;mso-position-vertical:absolute;mso-position-vertical-relative:text;mso-width-percent:0;mso-height-percent:0;mso-width-relative:page;mso-height-relative:page" o:gfxdata="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" strokecolor="#57602c" strokeweight=".25pt"/>
+            <v:shape id="AutoShape 17" o:spid="_x0000_s1026" type="#_x0000_t32" style="position:absolute;margin-left:-1.05pt;margin-top:1.75pt;width:439pt;height:0;z-index:251656704;visibility:visible;mso-wrap-style:square;mso-width-percent:0;mso-height-percent:0;mso-wrap-distance-left:9pt;mso-wrap-distance-top:-3e-5mm;mso-wrap-distance-right:9pt;mso-wrap-distance-bottom:-3e-5mm;mso-position-horizontal:absolute;mso-position-horizontal-relative:text;mso-position-vertical:absolute;mso-position-vertical-relative:text;mso-width-percent:0;mso-height-percent:0;mso-width-relative:page;mso-height-relative:page" o:gfxdata="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" strokecolor="#57602c" strokeweight=".25pt"/>
           </w:pict>
         </mc:Fallback>
       </mc:AlternateContent>
     </w:r>
-    <w:r>
-      <w:tab/>
-    </w:r>
-  </w:p>
-  <w:p>
-    <w:pPr>
-      <w:pStyle w:val="Encabezado"/>
-    </w:pPr>
   </w:p>
 </w:hdr>
 </file>

</xml_diff>